<commit_message>
Update TOCA Analysis Report with disclaimer
Co-Authored-By: Claude Opus 4.6 <noreply@anthropic.com>
</commit_message>
<xml_diff>
--- a/docs/Canadian_Big6_TOCA_Analysis_Report.docx
+++ b/docs/Canadian_Big6_TOCA_Analysis_Report.docx
@@ -7823,7 +7823,7 @@
       </w:r>
     </w:p>
     <w:p>
-      <w:hyperlink w:history="1" r:id="rIdrhkmttwt3fds-1ygo1kh3">
+      <w:hyperlink w:history="1" r:id="rIdsareh7jvfvskdja5_vexg">
         <w:r>
           <w:rPr>
             <w:rStyle w:val="Hyperlink"/>
@@ -7836,7 +7836,7 @@
       </w:hyperlink>
     </w:p>
     <w:p>
-      <w:hyperlink w:history="1" r:id="rId6qnkpjmyyzd7e4zmqiu2i">
+      <w:hyperlink w:history="1" r:id="rIdlwobekk8hv9zs035q_bqi">
         <w:r>
           <w:rPr>
             <w:rStyle w:val="Hyperlink"/>
@@ -7849,7 +7849,7 @@
       </w:hyperlink>
     </w:p>
     <w:p>
-      <w:hyperlink w:history="1" r:id="rId01shshy91xm0jdbdmxfnz">
+      <w:hyperlink w:history="1" r:id="rIdp_a5asvyndeixh0iza-7y">
         <w:r>
           <w:rPr>
             <w:rStyle w:val="Hyperlink"/>
@@ -7862,7 +7862,7 @@
       </w:hyperlink>
     </w:p>
     <w:p>
-      <w:hyperlink w:history="1" r:id="rIdjr8lte4vaitynhspqedpg">
+      <w:hyperlink w:history="1" r:id="rIdcz6exd6sjopir6vxw46yj">
         <w:r>
           <w:rPr>
             <w:rStyle w:val="Hyperlink"/>
@@ -7883,7 +7883,7 @@
       </w:r>
     </w:p>
     <w:p>
-      <w:hyperlink w:history="1" r:id="rIdrdzn2a-fksoocctjkw7jd">
+      <w:hyperlink w:history="1" r:id="rId1ds49e6xmdc0mc4dcjdi3">
         <w:r>
           <w:rPr>
             <w:rStyle w:val="Hyperlink"/>
@@ -7896,7 +7896,7 @@
       </w:hyperlink>
     </w:p>
     <w:p>
-      <w:hyperlink w:history="1" r:id="rIdpyqout1tjblum4naarcpp">
+      <w:hyperlink w:history="1" r:id="rIdkfakwmygd-km2fthbxbic">
         <w:r>
           <w:rPr>
             <w:rStyle w:val="Hyperlink"/>
@@ -7917,7 +7917,7 @@
       </w:r>
     </w:p>
     <w:p>
-      <w:hyperlink w:history="1" r:id="rId1nc1zknvwmnligll8dmb0">
+      <w:hyperlink w:history="1" r:id="rIdy8qiccx6sb-ehsg1tqdm5">
         <w:r>
           <w:rPr>
             <w:rStyle w:val="Hyperlink"/>
@@ -7938,7 +7938,7 @@
       </w:r>
     </w:p>
     <w:p>
-      <w:hyperlink w:history="1" r:id="rIdvqec6omnaba4zpvjla8mk">
+      <w:hyperlink w:history="1" r:id="rIdydcrtu0na5vqrpmuf9hid">
         <w:r>
           <w:rPr>
             <w:rStyle w:val="Hyperlink"/>
@@ -7959,7 +7959,7 @@
       </w:r>
     </w:p>
     <w:p>
-      <w:hyperlink w:history="1" r:id="rIdy9dszt_yxef0dxqrwwuqs">
+      <w:hyperlink w:history="1" r:id="rIde02xldac5tul1hzl0rdoi">
         <w:r>
           <w:rPr>
             <w:rStyle w:val="Hyperlink"/>
@@ -7983,7 +7983,7 @@
       <w:pPr>
         <w:spacing w:after="200"/>
       </w:pPr>
-      <w:hyperlink w:history="1" r:id="rIdqjcfgmttagmwy12afnsv1">
+      <w:hyperlink w:history="1" r:id="rIdbrcsxridvirixp7gtsgdo">
         <w:r>
           <w:rPr>
             <w:rStyle w:val="Hyperlink"/>
@@ -8004,7 +8004,7 @@
       </w:r>
     </w:p>
     <w:p>
-      <w:hyperlink w:history="1" r:id="rIdtwbry_ydj37yktyc4_h2s">
+      <w:hyperlink w:history="1" r:id="rId7u4tv0mfkndiyqvbth8mi">
         <w:r>
           <w:rPr>
             <w:rStyle w:val="Hyperlink"/>
@@ -8033,6 +8033,46 @@
           <w:szCs w:val="20"/>
         </w:rPr>
         <w:t xml:space="preserve">McKinsey Banking Operations Reports; Accenture Banking Technology Vision; Oliver Wyman Banking Efficiency Studies</w:t>
+      </w:r>
+    </w:p>
+    <w:p>
+      <w:pPr>
+        <w:spacing w:before="400"/>
+      </w:pPr>
+    </w:p>
+    <w:p>
+      <w:pPr>
+        <w:pBdr>
+          <w:top w:val="single" w:color="CCCCCC" w:sz="1" w:space="8"/>
+        </w:pBdr>
+        <w:spacing w:after="100" w:before="200"/>
+      </w:pPr>
+      <w:r>
+        <w:rPr>
+          <w:rFonts w:ascii="Arial" w:cs="Arial" w:eastAsia="Arial" w:hAnsi="Arial"/>
+          <w:b/>
+          <w:bCs/>
+          <w:color w:val="666666"/>
+          <w:sz w:val="18"/>
+          <w:szCs w:val="18"/>
+        </w:rPr>
+        <w:t xml:space="preserve">Disclaimer</w:t>
+      </w:r>
+    </w:p>
+    <w:p>
+      <w:pPr>
+        <w:spacing w:after="100"/>
+      </w:pPr>
+      <w:r>
+        <w:rPr>
+          <w:rFonts w:ascii="Arial" w:cs="Arial" w:eastAsia="Arial" w:hAnsi="Arial"/>
+          <w:i/>
+          <w:iCs/>
+          <w:color w:val="888888"/>
+          <w:sz w:val="18"/>
+          <w:szCs w:val="18"/>
+        </w:rPr>
+        <w:t xml:space="preserve">This document was produced with the assistance of MIA, an AI-powered research tool. It does not constitute investment, financial, or professional advice. All analysis is based entirely on publicly available information — no internal BMO data was used. Original sources and methodology have been provided so that readers may independently verify the findings. Estimates are approximations and carry ±3–5% uncertainty.</w:t>
       </w:r>
     </w:p>
     <w:sectPr>

</xml_diff>